<commit_message>
Doc for Blog # 6
Doc for Blog # 6
</commit_message>
<xml_diff>
--- a/Appium Blog-5.docx
+++ b/Appium Blog-5.docx
@@ -64,16 +64,20 @@
       <w:pPr>
         <w:rPr>
           <w:rFonts w:ascii="Times New Roman" w:hAnsi="Times New Roman" w:cs="Times New Roman"/>
-          <w:sz w:val="21"/>
-          <w:szCs w:val="21"/>
-          <w:lang w:val="en-US"/>
-        </w:rPr>
-      </w:pPr>
-      <w:r>
-        <w:rPr>
-          <w:rFonts w:ascii="Times New Roman" w:hAnsi="Times New Roman" w:cs="Times New Roman"/>
-          <w:sz w:val="21"/>
-          <w:szCs w:val="21"/>
+          <w:b/>
+          <w:sz w:val="21"/>
+          <w:szCs w:val="21"/>
+          <w:u w:val="single"/>
+          <w:lang w:val="en-US"/>
+        </w:rPr>
+      </w:pPr>
+      <w:r>
+        <w:rPr>
+          <w:rFonts w:ascii="Times New Roman" w:hAnsi="Times New Roman" w:cs="Times New Roman"/>
+          <w:b/>
+          <w:sz w:val="21"/>
+          <w:szCs w:val="21"/>
+          <w:u w:val="single"/>
           <w:lang w:val="en-US"/>
         </w:rPr>
         <w:t xml:space="preserve">Salient features of Inspector: </w:t>
@@ -124,7 +128,16 @@
           <w:szCs w:val="21"/>
           <w:lang w:val="en-US"/>
         </w:rPr>
-        <w:t>Just a click on preferred element to inspect that</w:t>
+        <w:t>Just a click on p</w:t>
+      </w:r>
+      <w:r>
+        <w:rPr>
+          <w:rFonts w:ascii="Times New Roman" w:hAnsi="Times New Roman" w:cs="Times New Roman"/>
+          <w:sz w:val="21"/>
+          <w:szCs w:val="21"/>
+          <w:lang w:val="en-US"/>
+        </w:rPr>
+        <w:t>referred element to inspect</w:t>
       </w:r>
     </w:p>
     <w:p>
@@ -148,7 +161,25 @@
           <w:szCs w:val="21"/>
           <w:lang w:val="en-US"/>
         </w:rPr>
-        <w:t>You can easily find the element coordinates</w:t>
+        <w:t xml:space="preserve">You can easily find the element </w:t>
+      </w:r>
+      <w:r>
+        <w:rPr>
+          <w:rFonts w:ascii="Times New Roman" w:hAnsi="Times New Roman" w:cs="Times New Roman"/>
+          <w:sz w:val="21"/>
+          <w:szCs w:val="21"/>
+          <w:lang w:val="en-US"/>
+        </w:rPr>
+        <w:t xml:space="preserve">and swipe </w:t>
+      </w:r>
+      <w:r>
+        <w:rPr>
+          <w:rFonts w:ascii="Times New Roman" w:hAnsi="Times New Roman" w:cs="Times New Roman"/>
+          <w:sz w:val="21"/>
+          <w:szCs w:val="21"/>
+          <w:lang w:val="en-US"/>
+        </w:rPr>
+        <w:t>coordinates</w:t>
       </w:r>
     </w:p>
     <w:p>
@@ -172,7 +203,70 @@
           <w:szCs w:val="21"/>
           <w:lang w:val="en-US"/>
         </w:rPr>
-        <w:t xml:space="preserve">You can Tap on a button and send values to any text field using “Tap” and “Send Keys” button  </w:t>
+        <w:t>For instant recognition of element, we can use inbuilt buttons like “</w:t>
+      </w:r>
+      <w:r>
+        <w:rPr>
+          <w:rFonts w:ascii="Times New Roman" w:hAnsi="Times New Roman" w:cs="Times New Roman"/>
+          <w:sz w:val="21"/>
+          <w:szCs w:val="21"/>
+          <w:lang w:val="en-US"/>
+        </w:rPr>
+        <w:t>Tap</w:t>
+      </w:r>
+      <w:r>
+        <w:rPr>
+          <w:rFonts w:ascii="Times New Roman" w:hAnsi="Times New Roman" w:cs="Times New Roman"/>
+          <w:sz w:val="21"/>
+          <w:szCs w:val="21"/>
+          <w:lang w:val="en-US"/>
+        </w:rPr>
+        <w:t>” and “SendKeys”</w:t>
+      </w:r>
+      <w:r>
+        <w:rPr>
+          <w:rFonts w:ascii="Times New Roman" w:hAnsi="Times New Roman" w:cs="Times New Roman"/>
+          <w:sz w:val="21"/>
+          <w:szCs w:val="21"/>
+          <w:lang w:val="en-US"/>
+        </w:rPr>
+        <w:t xml:space="preserve"> </w:t>
+      </w:r>
+      <w:r>
+        <w:rPr>
+          <w:rFonts w:ascii="Times New Roman" w:hAnsi="Times New Roman" w:cs="Times New Roman"/>
+          <w:sz w:val="21"/>
+          <w:szCs w:val="21"/>
+          <w:lang w:val="en-US"/>
+        </w:rPr>
+        <w:t xml:space="preserve">to click on any particular element </w:t>
+      </w:r>
+      <w:r>
+        <w:rPr>
+          <w:rFonts w:ascii="Times New Roman" w:hAnsi="Times New Roman" w:cs="Times New Roman"/>
+          <w:sz w:val="21"/>
+          <w:szCs w:val="21"/>
+          <w:lang w:val="en-US"/>
+        </w:rPr>
+        <w:t xml:space="preserve">and </w:t>
+      </w:r>
+      <w:r>
+        <w:rPr>
+          <w:rFonts w:ascii="Times New Roman" w:hAnsi="Times New Roman" w:cs="Times New Roman"/>
+          <w:sz w:val="21"/>
+          <w:szCs w:val="21"/>
+          <w:lang w:val="en-US"/>
+        </w:rPr>
+        <w:t>to pass value to any input field.</w:t>
+      </w:r>
+      <w:r>
+        <w:rPr>
+          <w:rFonts w:ascii="Times New Roman" w:hAnsi="Times New Roman" w:cs="Times New Roman"/>
+          <w:sz w:val="21"/>
+          <w:szCs w:val="21"/>
+          <w:lang w:val="en-US"/>
+        </w:rPr>
+        <w:t xml:space="preserve">  </w:t>
       </w:r>
     </w:p>
     <w:p>
@@ -220,7 +314,43 @@
           <w:szCs w:val="21"/>
           <w:lang w:val="en-US"/>
         </w:rPr>
-        <w:t>On successful element inspection attributes like “Name”, “Value”, “Label”, “ID”, “XPath” etc... will be displayed separately in a tabular column</w:t>
+        <w:t xml:space="preserve">On </w:t>
+      </w:r>
+      <w:r>
+        <w:rPr>
+          <w:rFonts w:ascii="Times New Roman" w:hAnsi="Times New Roman" w:cs="Times New Roman"/>
+          <w:sz w:val="21"/>
+          <w:szCs w:val="21"/>
+          <w:lang w:val="en-US"/>
+        </w:rPr>
+        <w:t xml:space="preserve">every </w:t>
+      </w:r>
+      <w:r>
+        <w:rPr>
+          <w:rFonts w:ascii="Times New Roman" w:hAnsi="Times New Roman" w:cs="Times New Roman"/>
+          <w:sz w:val="21"/>
+          <w:szCs w:val="21"/>
+          <w:lang w:val="en-US"/>
+        </w:rPr>
+        <w:t>successful element inspection</w:t>
+      </w:r>
+      <w:r>
+        <w:rPr>
+          <w:rFonts w:ascii="Times New Roman" w:hAnsi="Times New Roman" w:cs="Times New Roman"/>
+          <w:sz w:val="21"/>
+          <w:szCs w:val="21"/>
+          <w:lang w:val="en-US"/>
+        </w:rPr>
+        <w:t>,</w:t>
+      </w:r>
+      <w:r>
+        <w:rPr>
+          <w:rFonts w:ascii="Times New Roman" w:hAnsi="Times New Roman" w:cs="Times New Roman"/>
+          <w:sz w:val="21"/>
+          <w:szCs w:val="21"/>
+          <w:lang w:val="en-US"/>
+        </w:rPr>
+        <w:t xml:space="preserve"> attributes like “Name”, “Value”, “Label”, “ID”, “XPath” etc... will be displayed separately in a tabular column</w:t>
       </w:r>
     </w:p>
     <w:p>
@@ -244,7 +374,52 @@
           <w:szCs w:val="21"/>
           <w:lang w:val="en-US"/>
         </w:rPr>
-        <w:t>There are lot of element finding strategy available to search an element like “ID”, “Xpath”, “Class Name”, “UIAutomator Selector”, “Class Chain”, “NSPredicate” etc...</w:t>
+        <w:t>Based on platform, t</w:t>
+      </w:r>
+      <w:r>
+        <w:rPr>
+          <w:rFonts w:ascii="Times New Roman" w:hAnsi="Times New Roman" w:cs="Times New Roman"/>
+          <w:sz w:val="21"/>
+          <w:szCs w:val="21"/>
+          <w:lang w:val="en-US"/>
+        </w:rPr>
+        <w:t xml:space="preserve">here are lot of </w:t>
+      </w:r>
+      <w:r>
+        <w:rPr>
+          <w:rFonts w:ascii="Times New Roman" w:hAnsi="Times New Roman" w:cs="Times New Roman"/>
+          <w:sz w:val="21"/>
+          <w:szCs w:val="21"/>
+          <w:lang w:val="en-US"/>
+        </w:rPr>
+        <w:t>location</w:t>
+      </w:r>
+      <w:r>
+        <w:rPr>
+          <w:rFonts w:ascii="Times New Roman" w:hAnsi="Times New Roman" w:cs="Times New Roman"/>
+          <w:sz w:val="21"/>
+          <w:szCs w:val="21"/>
+          <w:lang w:val="en-US"/>
+        </w:rPr>
+        <w:t xml:space="preserve"> strategy available to </w:t>
+      </w:r>
+      <w:r>
+        <w:rPr>
+          <w:rFonts w:ascii="Times New Roman" w:hAnsi="Times New Roman" w:cs="Times New Roman"/>
+          <w:sz w:val="21"/>
+          <w:szCs w:val="21"/>
+          <w:lang w:val="en-US"/>
+        </w:rPr>
+        <w:t>find</w:t>
+      </w:r>
+      <w:r>
+        <w:rPr>
+          <w:rFonts w:ascii="Times New Roman" w:hAnsi="Times New Roman" w:cs="Times New Roman"/>
+          <w:sz w:val="21"/>
+          <w:szCs w:val="21"/>
+          <w:lang w:val="en-US"/>
+        </w:rPr>
+        <w:t xml:space="preserve"> an element like “ID”, “Xpath”, “Class Name”, “UIAutomator Selector”, “Class Chain”, “NSPredicate” etc...</w:t>
       </w:r>
     </w:p>
     <w:p>
@@ -282,7 +457,34 @@
           <w:szCs w:val="21"/>
           <w:lang w:val="en-US"/>
         </w:rPr>
-        <w:t xml:space="preserve">There are list of locator strategy available in Appium based on platforms. Based on its priority level, accessibility and performance we can select the appropriate locator strategy  </w:t>
+        <w:t xml:space="preserve">There are list of locator strategy available in Appium based on platforms. Based on its priority level, </w:t>
+      </w:r>
+      <w:r>
+        <w:rPr>
+          <w:rFonts w:ascii="Times New Roman" w:hAnsi="Times New Roman" w:cs="Times New Roman"/>
+          <w:sz w:val="21"/>
+          <w:szCs w:val="21"/>
+          <w:lang w:val="en-US"/>
+        </w:rPr>
+        <w:t xml:space="preserve">easy </w:t>
+      </w:r>
+      <w:r>
+        <w:rPr>
+          <w:rFonts w:ascii="Times New Roman" w:hAnsi="Times New Roman" w:cs="Times New Roman"/>
+          <w:sz w:val="21"/>
+          <w:szCs w:val="21"/>
+          <w:lang w:val="en-US"/>
+        </w:rPr>
+        <w:t>approachability</w:t>
+      </w:r>
+      <w:r>
+        <w:rPr>
+          <w:rFonts w:ascii="Times New Roman" w:hAnsi="Times New Roman" w:cs="Times New Roman"/>
+          <w:sz w:val="21"/>
+          <w:szCs w:val="21"/>
+          <w:lang w:val="en-US"/>
+        </w:rPr>
+        <w:t xml:space="preserve"> and performance we can select the appropriate locator strategy  </w:t>
       </w:r>
     </w:p>
     <w:p>
@@ -1026,28 +1228,8 @@
           <w:szCs w:val="21"/>
           <w:lang w:val="en-US"/>
         </w:rPr>
-        <w:t>strategy. In fact every element h</w:t>
-      </w:r>
-      <w:r>
-        <w:rPr>
-          <w:rFonts w:ascii="Times New Roman" w:hAnsi="Times New Roman" w:cs="Times New Roman"/>
-          <w:sz w:val="21"/>
-          <w:szCs w:val="21"/>
-          <w:lang w:val="en-US"/>
-        </w:rPr>
-        <w:t>as an own ID associated with it</w:t>
-      </w:r>
-      <w:r>
-        <w:rPr>
-          <w:rFonts w:ascii="Times New Roman" w:hAnsi="Times New Roman" w:cs="Times New Roman"/>
-          <w:sz w:val="21"/>
-          <w:szCs w:val="21"/>
-          <w:lang w:val="en-US"/>
-        </w:rPr>
-        <w:t xml:space="preserve">. </w:t>
-      </w:r>
-      <w:bookmarkStart w:id="0" w:name="_GoBack"/>
-      <w:bookmarkEnd w:id="0"/>
+        <w:t xml:space="preserve">strategy. In fact every element has an own ID associated with it. </w:t>
+      </w:r>
     </w:p>
     <w:p>
       <w:pPr>
@@ -1423,7 +1605,6 @@
           <w:u w:val="single"/>
           <w:lang w:val="en-US"/>
         </w:rPr>
-        <w:lastRenderedPageBreak/>
         <w:t>Name:</w:t>
       </w:r>
     </w:p>
@@ -2180,7 +2361,46 @@
           <w:szCs w:val="21"/>
           <w:lang w:val="en-US"/>
         </w:rPr>
-        <w:t xml:space="preserve"> strategy for some complex operations like, auto scrolling and finding an element with the given conditions.</w:t>
+        <w:t xml:space="preserve"> strategy </w:t>
+      </w:r>
+      <w:r>
+        <w:rPr>
+          <w:rFonts w:ascii="Times New Roman" w:eastAsia="Times New Roman" w:hAnsi="Times New Roman" w:cs="Times New Roman"/>
+          <w:color w:val="000000"/>
+          <w:sz w:val="21"/>
+          <w:szCs w:val="21"/>
+          <w:lang w:val="en-US"/>
+        </w:rPr>
+        <w:t xml:space="preserve">with </w:t>
+      </w:r>
+      <w:r>
+        <w:rPr>
+          <w:rFonts w:ascii="Times New Roman" w:hAnsi="Times New Roman" w:cs="Times New Roman"/>
+          <w:sz w:val="21"/>
+          <w:szCs w:val="21"/>
+          <w:lang w:val="en-US"/>
+        </w:rPr>
+        <w:t>UiScrollable</w:t>
+      </w:r>
+      <w:r>
+        <w:rPr>
+          <w:rFonts w:ascii="Times New Roman" w:eastAsia="Times New Roman" w:hAnsi="Times New Roman" w:cs="Times New Roman"/>
+          <w:color w:val="000000"/>
+          <w:sz w:val="21"/>
+          <w:szCs w:val="21"/>
+          <w:lang w:val="en-US"/>
+        </w:rPr>
+        <w:t xml:space="preserve"> function </w:t>
+      </w:r>
+      <w:r>
+        <w:rPr>
+          <w:rFonts w:ascii="Times New Roman" w:eastAsia="Times New Roman" w:hAnsi="Times New Roman" w:cs="Times New Roman"/>
+          <w:color w:val="000000"/>
+          <w:sz w:val="21"/>
+          <w:szCs w:val="21"/>
+          <w:lang w:val="en-US"/>
+        </w:rPr>
+        <w:t>for some complex operations like, auto scrolling and finding an element with the given conditions.</w:t>
       </w:r>
     </w:p>
     <w:p>
@@ -2287,7 +2507,67 @@
           <w:szCs w:val="21"/>
           <w:lang w:val="en-US"/>
         </w:rPr>
-        <w:t xml:space="preserve"> powered by Apple for its SDK products like XCode and you can design it more like an XPath query. </w:t>
+        <w:t xml:space="preserve"> powered by Apple for its </w:t>
+      </w:r>
+      <w:r>
+        <w:rPr>
+          <w:rFonts w:ascii="Times New Roman" w:eastAsia="Times New Roman" w:hAnsi="Times New Roman" w:cs="Times New Roman"/>
+          <w:color w:val="000000"/>
+          <w:sz w:val="21"/>
+          <w:szCs w:val="21"/>
+          <w:lang w:val="en-US"/>
+        </w:rPr>
+        <w:t xml:space="preserve">own </w:t>
+      </w:r>
+      <w:r>
+        <w:rPr>
+          <w:rFonts w:ascii="Times New Roman" w:eastAsia="Times New Roman" w:hAnsi="Times New Roman" w:cs="Times New Roman"/>
+          <w:color w:val="000000"/>
+          <w:sz w:val="21"/>
+          <w:szCs w:val="21"/>
+          <w:lang w:val="en-US"/>
+        </w:rPr>
+        <w:t xml:space="preserve">SDK </w:t>
+      </w:r>
+      <w:r>
+        <w:rPr>
+          <w:rFonts w:ascii="Times New Roman" w:eastAsia="Times New Roman" w:hAnsi="Times New Roman" w:cs="Times New Roman"/>
+          <w:color w:val="000000"/>
+          <w:sz w:val="21"/>
+          <w:szCs w:val="21"/>
+          <w:lang w:val="en-US"/>
+        </w:rPr>
+        <w:t>(</w:t>
+      </w:r>
+      <w:r>
+        <w:rPr>
+          <w:rFonts w:ascii="Times New Roman" w:eastAsia="Times New Roman" w:hAnsi="Times New Roman" w:cs="Times New Roman"/>
+          <w:color w:val="000000"/>
+          <w:sz w:val="21"/>
+          <w:szCs w:val="21"/>
+          <w:lang w:val="en-US"/>
+        </w:rPr>
+        <w:t>XCode</w:t>
+      </w:r>
+      <w:r>
+        <w:rPr>
+          <w:rFonts w:ascii="Times New Roman" w:eastAsia="Times New Roman" w:hAnsi="Times New Roman" w:cs="Times New Roman"/>
+          <w:color w:val="000000"/>
+          <w:sz w:val="21"/>
+          <w:szCs w:val="21"/>
+          <w:lang w:val="en-US"/>
+        </w:rPr>
+        <w:t>)</w:t>
+      </w:r>
+      <w:r>
+        <w:rPr>
+          <w:rFonts w:ascii="Times New Roman" w:eastAsia="Times New Roman" w:hAnsi="Times New Roman" w:cs="Times New Roman"/>
+          <w:color w:val="000000"/>
+          <w:sz w:val="21"/>
+          <w:szCs w:val="21"/>
+          <w:lang w:val="en-US"/>
+        </w:rPr>
+        <w:t xml:space="preserve"> and you can design it more like an XPath query. </w:t>
       </w:r>
     </w:p>
     <w:p>
@@ -2876,7 +3156,7 @@
           <w:u w:val="single"/>
           <w:lang w:val="en-US"/>
         </w:rPr>
-        <w:t>How to Inspect an Element using</w:t>
+        <w:t xml:space="preserve">How to </w:t>
       </w:r>
       <w:r>
         <w:rPr>
@@ -2887,16 +3167,7 @@
           <w:u w:val="single"/>
           <w:lang w:val="en-US"/>
         </w:rPr>
-        <w:t xml:space="preserve"> Inspecto</w:t>
-      </w:r>
-      <w:r>
-        <w:rPr>
-          <w:rFonts w:ascii="Times New Roman" w:hAnsi="Times New Roman" w:cs="Times New Roman"/>
-          <w:sz w:val="21"/>
-          <w:szCs w:val="21"/>
-          <w:lang w:val="en-US"/>
-        </w:rPr>
-        <w:t>r</w:t>
+        <w:t>find</w:t>
       </w:r>
       <w:r>
         <w:rPr>
@@ -2904,6 +3175,28 @@
           <w:b/>
           <w:sz w:val="21"/>
           <w:szCs w:val="21"/>
+          <w:u w:val="single"/>
+          <w:lang w:val="en-US"/>
+        </w:rPr>
+        <w:t xml:space="preserve"> an Element </w:t>
+      </w:r>
+      <w:r>
+        <w:rPr>
+          <w:rFonts w:ascii="Times New Roman" w:hAnsi="Times New Roman" w:cs="Times New Roman"/>
+          <w:b/>
+          <w:sz w:val="21"/>
+          <w:szCs w:val="21"/>
+          <w:u w:val="single"/>
+          <w:lang w:val="en-US"/>
+        </w:rPr>
+        <w:t>by navigating via AppSource</w:t>
+      </w:r>
+      <w:r>
+        <w:rPr>
+          <w:rFonts w:ascii="Times New Roman" w:hAnsi="Times New Roman" w:cs="Times New Roman"/>
+          <w:b/>
+          <w:sz w:val="21"/>
+          <w:szCs w:val="21"/>
           <w:lang w:val="en-US"/>
         </w:rPr>
         <w:t>?</w:t>
@@ -2993,36 +3286,90 @@
           <w:szCs w:val="21"/>
           <w:lang w:val="en-US"/>
         </w:rPr>
-        <w:t>All set and connection is established successfully, once you started seeing the mobile phone screen on your Appium Inspector you can start spying the elements.</w:t>
-      </w:r>
-    </w:p>
-    <w:p>
-      <w:pPr>
-        <w:rPr>
-          <w:rFonts w:ascii="Times New Roman" w:hAnsi="Times New Roman" w:cs="Times New Roman"/>
-          <w:sz w:val="21"/>
-          <w:szCs w:val="21"/>
-          <w:lang w:val="en-US"/>
-        </w:rPr>
-      </w:pPr>
-    </w:p>
-    <w:p>
-      <w:pPr>
-        <w:rPr>
-          <w:rFonts w:ascii="Times New Roman" w:hAnsi="Times New Roman" w:cs="Times New Roman"/>
-          <w:sz w:val="21"/>
-          <w:szCs w:val="21"/>
-          <w:lang w:val="en-US"/>
-        </w:rPr>
-      </w:pPr>
-      <w:r>
-        <w:rPr>
-          <w:rFonts w:ascii="Times New Roman" w:hAnsi="Times New Roman" w:cs="Times New Roman"/>
-          <w:sz w:val="21"/>
-          <w:szCs w:val="21"/>
-          <w:lang w:val="en-US"/>
-        </w:rPr>
-        <w:t>For this tutorial I have selected “JetAudio” media player application. You can select any of your preferred application. Come let’s see how to inspecting Elements for XCUI.</w:t>
+        <w:t>All set and connection is est</w:t>
+      </w:r>
+      <w:r>
+        <w:rPr>
+          <w:rFonts w:ascii="Times New Roman" w:hAnsi="Times New Roman" w:cs="Times New Roman"/>
+          <w:sz w:val="21"/>
+          <w:szCs w:val="21"/>
+          <w:lang w:val="en-US"/>
+        </w:rPr>
+        <w:t>ablished successfully, once</w:t>
+      </w:r>
+      <w:r>
+        <w:rPr>
+          <w:rFonts w:ascii="Times New Roman" w:hAnsi="Times New Roman" w:cs="Times New Roman"/>
+          <w:sz w:val="21"/>
+          <w:szCs w:val="21"/>
+          <w:lang w:val="en-US"/>
+        </w:rPr>
+        <w:t xml:space="preserve"> the mobile phone screen </w:t>
+      </w:r>
+      <w:r>
+        <w:rPr>
+          <w:rFonts w:ascii="Times New Roman" w:hAnsi="Times New Roman" w:cs="Times New Roman"/>
+          <w:sz w:val="21"/>
+          <w:szCs w:val="21"/>
+          <w:lang w:val="en-US"/>
+        </w:rPr>
+        <w:t xml:space="preserve">got captured </w:t>
+      </w:r>
+      <w:r>
+        <w:rPr>
+          <w:rFonts w:ascii="Times New Roman" w:hAnsi="Times New Roman" w:cs="Times New Roman"/>
+          <w:sz w:val="21"/>
+          <w:szCs w:val="21"/>
+          <w:lang w:val="en-US"/>
+        </w:rPr>
+        <w:t>on Appium Inspector you can start spying the elements.</w:t>
+      </w:r>
+    </w:p>
+    <w:p>
+      <w:pPr>
+        <w:rPr>
+          <w:rFonts w:ascii="Times New Roman" w:hAnsi="Times New Roman" w:cs="Times New Roman"/>
+          <w:sz w:val="21"/>
+          <w:szCs w:val="21"/>
+          <w:lang w:val="en-US"/>
+        </w:rPr>
+      </w:pPr>
+    </w:p>
+    <w:p>
+      <w:pPr>
+        <w:rPr>
+          <w:rFonts w:ascii="Times New Roman" w:hAnsi="Times New Roman" w:cs="Times New Roman"/>
+          <w:sz w:val="21"/>
+          <w:szCs w:val="21"/>
+          <w:lang w:val="en-US"/>
+        </w:rPr>
+      </w:pPr>
+      <w:r>
+        <w:rPr>
+          <w:rFonts w:ascii="Times New Roman" w:hAnsi="Times New Roman" w:cs="Times New Roman"/>
+          <w:sz w:val="21"/>
+          <w:szCs w:val="21"/>
+          <w:lang w:val="en-US"/>
+        </w:rPr>
+        <w:t>For this tutorial I have selected “JetAudio” media player application</w:t>
+      </w:r>
+      <w:r>
+        <w:rPr>
+          <w:rFonts w:ascii="Times New Roman" w:hAnsi="Times New Roman" w:cs="Times New Roman"/>
+          <w:sz w:val="21"/>
+          <w:szCs w:val="21"/>
+          <w:lang w:val="en-US"/>
+        </w:rPr>
+        <w:t xml:space="preserve"> for XCUI</w:t>
+      </w:r>
+      <w:r>
+        <w:rPr>
+          <w:rFonts w:ascii="Times New Roman" w:hAnsi="Times New Roman" w:cs="Times New Roman"/>
+          <w:sz w:val="21"/>
+          <w:szCs w:val="21"/>
+          <w:lang w:val="en-US"/>
+        </w:rPr>
+        <w:t>. You can select any of your preferred application. Come let’s see how to inspecting Elements for XCUI.</w:t>
       </w:r>
     </w:p>
     <w:p>
@@ -3714,6 +4061,7 @@
           <w:lang w:val="en-US"/>
         </w:rPr>
       </w:pPr>
+      <w:bookmarkStart w:id="0" w:name="_GoBack"/>
       <w:r>
         <w:rPr>
           <w:rFonts w:ascii="Times New Roman" w:hAnsi="Times New Roman" w:cs="Times New Roman"/>
@@ -3722,9 +4070,20 @@
           <w:szCs w:val="21"/>
           <w:lang w:val="en-US"/>
         </w:rPr>
-        <w:t>How to find element using locator and Selector?</w:t>
-      </w:r>
-    </w:p>
+        <w:t xml:space="preserve">How to inspect an </w:t>
+      </w:r>
+      <w:r>
+        <w:rPr>
+          <w:rFonts w:ascii="Times New Roman" w:hAnsi="Times New Roman" w:cs="Times New Roman"/>
+          <w:b/>
+          <w:sz w:val="21"/>
+          <w:szCs w:val="21"/>
+          <w:lang w:val="en-US"/>
+        </w:rPr>
+        <w:t>element using locator and Selector?</w:t>
+      </w:r>
+    </w:p>
+    <w:bookmarkEnd w:id="0"/>
     <w:p>
       <w:pPr>
         <w:rPr>
@@ -4160,7 +4519,16 @@
           <w:szCs w:val="21"/>
           <w:lang w:val="en-US"/>
         </w:rPr>
-        <w:t xml:space="preserve">n click on “Search” button the next screen will appear if the given selector is valid and found in the screen. Inspector will always shows the elementID as a search result. </w:t>
+        <w:t>n click of</w:t>
+      </w:r>
+      <w:r>
+        <w:rPr>
+          <w:rFonts w:ascii="Times New Roman" w:hAnsi="Times New Roman" w:cs="Times New Roman"/>
+          <w:sz w:val="21"/>
+          <w:szCs w:val="21"/>
+          <w:lang w:val="en-US"/>
+        </w:rPr>
+        <w:t xml:space="preserve"> “Search” button the next screen will appear if the given selector is valid and found in the screen. Inspector will always shows the elementID as a search result. </w:t>
       </w:r>
     </w:p>
     <w:p>

</xml_diff>